<commit_message>
fix durable Telegram projection and scoped settlement
</commit_message>
<xml_diff>
--- a/doc/TG群抽奖机器人PRD_V1.3_实现对齐版.docx
+++ b/doc/TG群抽奖机器人PRD_V1.3_实现对齐版.docx
@@ -3429,7 +3429,7 @@
           <w:color w:val="000000"/>
           <w:sz w:val="22"/>
         </w:rPr>
-        <w:t>系统完成有效性校验后，才把邀请奖励写入邀请人的票数账本。</w:t>
+        <w:t>系统完成有效性校验且被邀请人不是邀请人本人后，才把邀请奖励写入邀请人的票数账本；成员使用自己的链接离群重入不得获得邀请票。</w:t>
       </w:r>
     </w:p>
     <w:p>
@@ -10055,7 +10055,7 @@
         <w:rPr>
           <w:rFonts w:ascii="Arial Unicode MS" w:hAnsi="Arial Unicode MS" w:eastAsia="Arial Unicode MS" w:cs="Arial Unicode MS"/>
         </w:rPr>
-        <w:t>截止任务先把活动转为结算中，排空截止前 Update、完成邀请及频道复核；条件全部通过后才冻结候选人、资格、票数和规则版本，生成不可变快照与 snapshot_hash，并转为可开奖。</w:t>
+        <w:t>截止任务先把活动转为结算中，只排空路由到本活动或目标群的截止前 Update，再完成邀请及频道复核；其他群的失败 Update 不得阻断本活动。条件全部通过后才冻结候选人、资格、票数和规则版本，生成不可变快照与 snapshot_hash，并转为可开奖。</w:t>
       </w:r>
     </w:p>
     <w:p>
@@ -10126,7 +10126,7 @@
         <w:rPr>
           <w:rFonts w:ascii="Arial Unicode MS" w:hAnsi="Arial Unicode MS" w:eastAsia="Arial Unicode MS" w:cs="Arial Unicode MS"/>
         </w:rPr>
-        <w:t>机器人必须是目标群管理员，并具备发送消息、管理邀请链接及接收成员状态所需权限；发布前和关键操作前均重新检查权限。</w:t>
+        <w:t>机器人必须是目标群管理员，并具备发送消息、管理邀请链接及接收成员状态所需权限；chat_member/my_chat_member 事件同步管理员缓存和 Bot 撤权状态，发布、领奖登记等关键操作仍实时重新检查权限。</w:t>
       </w:r>
     </w:p>
     <w:p>
@@ -10156,7 +10156,7 @@
         <w:rPr>
           <w:rFonts w:ascii="Arial Unicode MS" w:hAnsi="Arial Unicode MS" w:eastAsia="Arial Unicode MS" w:cs="Arial Unicode MS"/>
         </w:rPr>
-        <w:t>long polling 的 allowed_updates 显式包含 message、callback_query、chat_member、my_chat_member、chat_join_request。chat_member 默认不会随空列表自动订阅。</w:t>
+        <w:t>long polling 的 allowed_updates 显式请求 aiogram 当前支持的全部 UpdateType，避免被过滤类型造成 update_id 假缺口；Inbox 同时保存 routing_chat_id/routing_campaign_id，用于按群和活动隔离排空与故障。</w:t>
       </w:r>
     </w:p>
     <w:p>
@@ -17713,7 +17713,7 @@
         <w:rPr>
           <w:rFonts w:ascii="Arial Unicode MS" w:hAnsi="Arial Unicode MS" w:eastAsia="Arial Unicode MS" w:cs="Arial Unicode MS"/>
         </w:rPr>
-        <w:t>调用前先在 Outbox 提交 gateway_started_at 与 request_hash；调用后另起事务追加 DeliveryAttempt=confirmed/failed/unknown，再投影业务状态。</w:t>
+        <w:t>调用前先在 Outbox 提交 gateway_started_at 与 request_hash；调用后先用独立事务持久化净化后的 DeliveryAttempt=confirmed/failed/unknown。CONFIRMED 再执行幂等业务投影；投影失败保持远端成功事实且禁止重发，由 confirmed/unprojected 队列重放并告警。邀请链接明文不得进入 DeliveryAttempt。</w:t>
       </w:r>
     </w:p>
     <w:p>

</xml_diff>